<commit_message>
Link guide to public repository
</commit_message>
<xml_diff>
--- a/docs/Hosting-an-MCP-server-on-Azure.docx
+++ b/docs/Hosting-an-MCP-server-on-Azure.docx
@@ -17,7 +17,19 @@
     </w:p>
     <w:p>
       <w:r>
-        <w:t>You can use the example MCP code in this repository or adapt your own MCP. You may keep the code in GitHub or work from a local folder. GitHub is useful for teamwork and version history, but it is not required. The guide uses the Microsoft web portals and three Azure CLI commands. You can run the commands in Azure Cloud Shell, so you do not need Docker on your computer.</w:t>
+        <w:t xml:space="preserve">You can use the example MCP code at </w:t>
+      </w:r>
+      <w:hyperlink r:id="rId1">
+        <w:r>
+          <w:rPr>
+            <w:color w:val="0563C1"/>
+            <w:u w:val="single"/>
+          </w:rPr>
+          <w:t>https://github.com/DataPandaEU/mcp-on-azure-public</w:t>
+        </w:r>
+      </w:hyperlink>
+      <w:r>
+        <w:t xml:space="preserve"> or adapt your own MCP. You may keep the code in GitHub or work from a local folder. GitHub is useful for teamwork and version history, but it is not required. The guide uses the Microsoft web portals and three Azure CLI commands. You can run the commands in Azure Cloud Shell, so you do not need Docker on your computer.</w:t>
       </w:r>
     </w:p>
     <w:p>
@@ -313,7 +325,19 @@
     <w:p>
       <w:pPr/>
       <w:r>
-        <w:t>Start with the working example in this repository. Azure does not create this code for you. You provide the source folder, and Azure builds an image from it in step 4.</w:t>
+        <w:t xml:space="preserve">Start with the working example at </w:t>
+      </w:r>
+      <w:hyperlink r:id="rId1">
+        <w:r>
+          <w:rPr>
+            <w:color w:val="0563C1"/>
+            <w:u w:val="single"/>
+          </w:rPr>
+          <w:t>https://github.com/DataPandaEU/mcp-on-azure-public</w:t>
+        </w:r>
+      </w:hyperlink>
+      <w:r>
+        <w:t>. Azure does not create this code for you. You provide the source folder, and Azure builds an image from it in step 4.</w:t>
       </w:r>
     </w:p>
     <w:p>
@@ -321,7 +345,19 @@
         <w:pStyle w:val="ListBullet"/>
       </w:pPr>
       <w:r>
-        <w:t>GitHub route, recommended for a team: open the example repository and choose Use this template, then Create a new repository. Create a private copy in your company account. GitHub then holds the source and its change history.</w:t>
+        <w:t xml:space="preserve">GitHub route, recommended for a team: open </w:t>
+      </w:r>
+      <w:hyperlink r:id="rId1">
+        <w:r>
+          <w:rPr>
+            <w:color w:val="0563C1"/>
+            <w:u w:val="single"/>
+          </w:rPr>
+          <w:t>https://github.com/DataPandaEU/mcp-on-azure-public</w:t>
+        </w:r>
+      </w:hyperlink>
+      <w:r>
+        <w:t xml:space="preserve"> and choose Use this template, then Create a new repository. Create a private copy in your company account. GitHub then holds the source and its change history.</w:t>
       </w:r>
     </w:p>
     <w:p>

</xml_diff>